<commit_message>
updated slippage model GUI user guide walkthrough to align with updated directory structure
</commit_message>
<xml_diff>
--- a/docs/Slippage Model GUI User Guide.docx
+++ b/docs/Slippage Model GUI User Guide.docx
@@ -188,7 +188,39 @@
           <w:i/>
           <w:iCs/>
         </w:rPr>
-        <w:t xml:space="preserve"> run frontend.py</w:t>
+        <w:t xml:space="preserve"> </w:t>
+      </w:r>
+      <w:proofErr w:type="gramStart"/>
+      <w:r>
+        <w:rPr>
+          <w:i/>
+          <w:iCs/>
+        </w:rPr>
+        <w:t>run .</w:t>
+      </w:r>
+      <w:proofErr w:type="gramEnd"/>
+      <w:r>
+        <w:rPr>
+          <w:i/>
+          <w:iCs/>
+        </w:rPr>
+        <w:t>\</w:t>
+      </w:r>
+      <w:proofErr w:type="spellStart"/>
+      <w:r>
+        <w:rPr>
+          <w:i/>
+          <w:iCs/>
+        </w:rPr>
+        <w:t>gui</w:t>
+      </w:r>
+      <w:proofErr w:type="spellEnd"/>
+      <w:r>
+        <w:rPr>
+          <w:i/>
+          <w:iCs/>
+        </w:rPr>
+        <w:t>\frontend.py</w:t>
       </w:r>
       <w:r>
         <w:t>”</w:t>
@@ -367,6 +399,9 @@
         <w:ind w:right="810"/>
       </w:pPr>
       <w:r>
+        <w:rPr>
+          <w:noProof/>
+        </w:rPr>
         <w:drawing>
           <wp:anchor distT="0" distB="0" distL="114300" distR="114300" simplePos="0" relativeHeight="251658240" behindDoc="0" locked="0" layoutInCell="1" allowOverlap="1" wp14:anchorId="577B8992" wp14:editId="37610C76">
             <wp:simplePos x="0" y="0"/>
@@ -789,6 +824,9 @@
         <w:spacing w:after="0" w:line="240" w:lineRule="auto"/>
       </w:pPr>
       <w:r>
+        <w:rPr>
+          <w:noProof/>
+        </w:rPr>
         <w:drawing>
           <wp:inline distT="0" distB="0" distL="0" distR="0" wp14:anchorId="3CAC8787" wp14:editId="6A847585">
             <wp:extent cx="5943600" cy="2681605"/>
@@ -995,6 +1033,9 @@
         <w:ind w:right="720" w:firstLine="720"/>
       </w:pPr>
       <w:r>
+        <w:rPr>
+          <w:noProof/>
+        </w:rPr>
         <w:drawing>
           <wp:inline distT="0" distB="0" distL="0" distR="0" wp14:anchorId="68D69CA4" wp14:editId="4853D086">
             <wp:extent cx="5031167" cy="1385778"/>
@@ -1123,7 +1164,18 @@
         <w:t>into the app</w:t>
       </w:r>
       <w:r>
-        <w:t>lication. You can find this file in the ‘data inputs’ subfolder within the plant-inspection-station-simulation folder you downloaded when installing the application.</w:t>
+        <w:t>lication. You can find this file in the ‘</w:t>
+      </w:r>
+      <w:proofErr w:type="spellStart"/>
+      <w:r>
+        <w:t>gui</w:t>
+      </w:r>
+      <w:proofErr w:type="spellEnd"/>
+      <w:r>
+        <w:t>/</w:t>
+      </w:r>
+      <w:r>
+        <w:t>data inputs’ subfolder within the plant-inspection-station-simulation folder you downloaded when installing the application.</w:t>
       </w:r>
       <w:r>
         <w:t xml:space="preserve"> </w:t>
@@ -1467,6 +1519,9 @@
         <w:jc w:val="center"/>
       </w:pPr>
       <w:r>
+        <w:rPr>
+          <w:noProof/>
+        </w:rPr>
         <w:lastRenderedPageBreak/>
         <w:drawing>
           <wp:inline distT="0" distB="0" distL="0" distR="0" wp14:anchorId="33E626A0" wp14:editId="52737B85">
@@ -2036,6 +2091,9 @@
         <w:jc w:val="center"/>
       </w:pPr>
       <w:r>
+        <w:rPr>
+          <w:noProof/>
+        </w:rPr>
         <w:lastRenderedPageBreak/>
         <w:drawing>
           <wp:inline distT="0" distB="0" distL="0" distR="0" wp14:anchorId="12B08AF9" wp14:editId="0BC16D0F">
@@ -2804,6 +2862,9 @@
         <w:jc w:val="center"/>
       </w:pPr>
       <w:r>
+        <w:rPr>
+          <w:noProof/>
+        </w:rPr>
         <w:drawing>
           <wp:inline distT="0" distB="0" distL="0" distR="0" wp14:anchorId="1A39B154" wp14:editId="1C408D43">
             <wp:extent cx="5503653" cy="2628935"/>
@@ -3343,6 +3404,9 @@
         <w:jc w:val="center"/>
       </w:pPr>
       <w:r>
+        <w:rPr>
+          <w:noProof/>
+        </w:rPr>
         <w:drawing>
           <wp:inline distT="0" distB="0" distL="0" distR="0" wp14:anchorId="3E8A8D3E" wp14:editId="786652A3">
             <wp:extent cx="4994694" cy="3809521"/>
@@ -3649,6 +3713,9 @@
         <w:br w:type="page"/>
       </w:r>
       <w:r>
+        <w:rPr>
+          <w:noProof/>
+        </w:rPr>
         <w:lastRenderedPageBreak/>
         <w:drawing>
           <wp:inline distT="0" distB="0" distL="0" distR="0" wp14:anchorId="1CB7D27F" wp14:editId="7D9F3430">
@@ -4104,6 +4171,9 @@
         <w:jc w:val="center"/>
       </w:pPr>
       <w:r>
+        <w:rPr>
+          <w:noProof/>
+        </w:rPr>
         <w:drawing>
           <wp:inline distT="0" distB="0" distL="0" distR="0" wp14:anchorId="426EB888" wp14:editId="61AB01AC">
             <wp:extent cx="5347079" cy="3113417"/>

</xml_diff>